<commit_message>
had to break reference for PDF versions to correctly list figure and table numbers
</commit_message>
<xml_diff>
--- a/Paper/Medical_Physics/Accepted_Submission/Figures/Figure 2.docx
+++ b/Paper/Medical_Physics/Accepted_Submission/Figures/Figure 2.docx
@@ -25,8 +25,9 @@
           <w:sz w:val="24"/>
           <w:szCs w:val="24"/>
         </w:rPr>
-        <w:t xml:space="preserve">Figure </w:t>
+        <w:t>Figure</w:t>
       </w:r>
+      <w:bookmarkEnd w:id="0"/>
       <w:r>
         <w:rPr>
           <w:rFonts w:ascii="Times New Roman" w:hAnsi="Times New Roman"/>
@@ -35,50 +36,10 @@
           <w:sz w:val="24"/>
           <w:szCs w:val="24"/>
         </w:rPr>
-        <w:fldChar w:fldCharType="begin"/>
+        <w:t xml:space="preserve"> 2</w:t>
       </w:r>
-      <w:r>
-        <w:rPr>
-          <w:rFonts w:ascii="Times New Roman" w:hAnsi="Times New Roman"/>
-          <w:i w:val="0"/>
-          <w:color w:val="auto"/>
-          <w:sz w:val="24"/>
-          <w:szCs w:val="24"/>
-        </w:rPr>
-        <w:instrText>SEQ Figure \* ARABIC</w:instrText>
-      </w:r>
-      <w:r>
-        <w:rPr>
-          <w:rFonts w:ascii="Times New Roman" w:hAnsi="Times New Roman"/>
-          <w:i w:val="0"/>
-          <w:color w:val="auto"/>
-          <w:sz w:val="24"/>
-          <w:szCs w:val="24"/>
-        </w:rPr>
-        <w:fldChar w:fldCharType="separate"/>
-      </w:r>
-      <w:r>
-        <w:rPr>
-          <w:rFonts w:ascii="Times New Roman" w:hAnsi="Times New Roman"/>
-          <w:i w:val="0"/>
-          <w:noProof/>
-          <w:color w:val="auto"/>
-          <w:sz w:val="24"/>
-          <w:szCs w:val="24"/>
-        </w:rPr>
-        <w:t>2</w:t>
-      </w:r>
-      <w:r>
-        <w:rPr>
-          <w:rFonts w:ascii="Times New Roman" w:hAnsi="Times New Roman"/>
-          <w:i w:val="0"/>
-          <w:color w:val="auto"/>
-          <w:sz w:val="24"/>
-          <w:szCs w:val="24"/>
-        </w:rPr>
-        <w:fldChar w:fldCharType="end"/>
-      </w:r>
-      <w:bookmarkEnd w:id="0"/>
+      <w:bookmarkStart w:id="1" w:name="_GoBack"/>
+      <w:bookmarkEnd w:id="1"/>
       <w:r>
         <w:rPr>
           <w:rFonts w:ascii="Times New Roman" w:hAnsi="Times New Roman"/>
@@ -214,10 +175,7 @@
         </mc:AlternateContent>
       </w:r>
     </w:p>
-    <w:p>
-      <w:bookmarkStart w:id="1" w:name="_GoBack"/>
-      <w:bookmarkEnd w:id="1"/>
-    </w:p>
+    <w:p/>
     <w:sectPr>
       <w:pgSz w:w="12240" w:h="15840"/>
       <w:pgMar w:top="1440" w:right="1440" w:bottom="1440" w:left="1440" w:header="720" w:footer="720" w:gutter="0"/>

</xml_diff>